<commit_message>
v2.0 — Équilibrage modèle, port Spark UI, optimisation mémoire, correctifs Grafana
- Reservoir d'apprentissage équilibré par classe (2500 fake + 2500 réel)
  pour empêcher le biais vers fake lors d'injections de drift
- WeightedRandomSampler dans l'entraînement + poids CrossEntropy inverse fréquence
- Dataset prétraité 50/50 fake/réel avec split 60/20/20
- Port Spark UI (4040) exposé + interface web activée dans spark_streaming.py
- Optimisation mémoire : Spark 4G→3G, ES JVM 384m→256m, drift 15min→30min
- Fix Grafana : execErrState Error→Alerting (résout "Unknown state execution_error")
- Panneau alertes Grafana corrigé, dashboard renommé v2.0
- Streamlit page "À propos" v2.0 : contexte africain, port 4040, performances équilibrées
- README mis à jour : port Spark, prérequis 8GB min, contexte Afrique subsaharienne
- Documents Mémoire v5 et Documentation v7 mis à jour (section Mises à jour v2.0)
</commit_message>
<xml_diff>
--- a/Memoire_Master2_IBDIA_KOMOSSI_Sosso_v5.docx
+++ b/Memoire_Master2_IBDIA_KOMOSSI_Sosso_v5.docx
@@ -52613,6 +52613,384 @@
         <w:rPr>
           <w:rtl w:val="0"/>
         </w:rPr>
+      </w:r>
+    </w:p>
+    <w:p>
+      <w:r>
+        <w:br w:type="page"/>
+      </w:r>
+    </w:p>
+    <w:p>
+      <w:pPr>
+        <w:pStyle w:val="Heading1"/>
+      </w:pPr>
+      <w:r>
+        <w:rPr>
+          <w:color w:val="1A537E"/>
+        </w:rPr>
+        <w:t>Mises à jour Version 2.0</w:t>
+      </w:r>
+    </w:p>
+    <w:p>
+      <w:pPr>
+        <w:spacing w:after="240"/>
+      </w:pPr>
+      <w:r>
+        <w:t>Les modifications suivantes ont été apportées au projet dans le cadre de la version 2.0 (avril 2026). Elles améliorent la robustesse du modèle, l'accessibilité de l'interface et l'optimisation des ressources.</w:t>
+      </w:r>
+    </w:p>
+    <w:p>
+      <w:pPr>
+        <w:spacing w:before="200" w:after="80"/>
+      </w:pPr>
+      <w:r>
+        <w:rPr>
+          <w:b/>
+          <w:color w:val="2C3E50"/>
+          <w:sz w:val="22"/>
+        </w:rPr>
+        <w:t>🔵 Équilibrage du dataset d'entraînement</w:t>
+      </w:r>
+    </w:p>
+    <w:p>
+      <w:pPr>
+        <w:spacing w:after="160"/>
+        <w:ind w:left="432"/>
+      </w:pPr>
+      <w:r>
+        <w:t>Le corpus est désormais sous-échantillonné pour garantir 50 % d'articles faux et 50 % d'articles vrais avant entraînement. Le split est passé de 80/10/10 à 60/20/20 (train/validation/test). Un WeightedRandomSampler assure des mini-batchs équilibrés même en cas de légère imbalance résiduelle.</w:t>
+      </w:r>
+    </w:p>
+    <w:p>
+      <w:pPr>
+        <w:spacing w:before="200" w:after="80"/>
+      </w:pPr>
+      <w:r>
+        <w:rPr>
+          <w:b/>
+          <w:color w:val="2C3E50"/>
+          <w:sz w:val="22"/>
+        </w:rPr>
+        <w:t>🔵 Reservoir d'apprentissage continu équilibré par classe</w:t>
+      </w:r>
+    </w:p>
+    <w:p>
+      <w:pPr>
+        <w:spacing w:after="160"/>
+        <w:ind w:left="432"/>
+      </w:pPr>
+      <w:r>
+        <w:t>Le buffer de replay (Reservoir Sampling) est maintenant divisé en deux sous-buffers indépendants : 2 500 exemples faux + 2 500 exemples vrais. Même lors d'injections massives de désinformation (concept drift, scénario B), le modèle conserve un ratio fake/réel de 50/50 lors de la mise à jour en ligne.</w:t>
+      </w:r>
+    </w:p>
+    <w:p>
+      <w:pPr>
+        <w:spacing w:before="200" w:after="80"/>
+      </w:pPr>
+      <w:r>
+        <w:rPr>
+          <w:b/>
+          <w:color w:val="2C3E50"/>
+          <w:sz w:val="22"/>
+        </w:rPr>
+        <w:t>🔵 Poids de classe corrigés dans la loss en ligne</w:t>
+      </w:r>
+    </w:p>
+    <w:p>
+      <w:pPr>
+        <w:spacing w:after="160"/>
+        <w:ind w:left="432"/>
+      </w:pPr>
+      <w:r>
+        <w:t>La fonction de perte CrossEntropyLoss utilise désormais des poids inversement proportionnels à la fréquence de chaque classe dans le mini-batch. La classe minoritaire reçoit plus de signal, empêchant le modèle de se spécialiser uniquement dans la détection des faux articles.</w:t>
+      </w:r>
+    </w:p>
+    <w:p>
+      <w:pPr>
+        <w:spacing w:before="200" w:after="80"/>
+      </w:pPr>
+      <w:r>
+        <w:rPr>
+          <w:b/>
+          <w:color w:val="2C3E50"/>
+          <w:sz w:val="22"/>
+        </w:rPr>
+        <w:t>🔵 Port Spark UI exposé (port 4040)</w:t>
+      </w:r>
+    </w:p>
+    <w:p>
+      <w:pPr>
+        <w:spacing w:after="160"/>
+        <w:ind w:left="432"/>
+      </w:pPr>
+      <w:r>
+        <w:t>L'interface web de monitoring Apache Spark est maintenant accessible sur le port 4040. Elle permet de visualiser les jobs Spark Streaming en cours, les DAG d'exécution, les statistiques de traitement et les métriques des micro-batchs en temps réel.</w:t>
+      </w:r>
+    </w:p>
+    <w:p>
+      <w:pPr>
+        <w:spacing w:before="200" w:after="80"/>
+      </w:pPr>
+      <w:r>
+        <w:rPr>
+          <w:b/>
+          <w:color w:val="2C3E50"/>
+          <w:sz w:val="22"/>
+        </w:rPr>
+        <w:t>🔵 Optimisation mémoire — machine 12 GB RAM</w:t>
+      </w:r>
+    </w:p>
+    <w:p>
+      <w:pPr>
+        <w:spacing w:after="160"/>
+        <w:ind w:left="432"/>
+      </w:pPr>
+      <w:r>
+        <w:t>La consommation mémoire totale a été réduite de ~2.3 GB pour permettre l'ouverture d'un navigateur (Firefox) pendant l'exécution du pipeline :</w:t>
+        <w:br/>
+        <w:t>• Spark driver JVM : 1 500 m → 1 200 m (-300 MB)</w:t>
+        <w:br/>
+        <w:t>• Spark container limit : 4 GB → 3 GB (-1 GB)</w:t>
+        <w:br/>
+        <w:t>• Elasticsearch JVM : 384 m → 256 m (-128 MB)</w:t>
+        <w:br/>
+        <w:t>• Elasticsearch container : 768 M → 512 M (-256 MB)</w:t>
+        <w:br/>
+        <w:t>• Drift injector interval : 15 min → 30 min (-50 % pression CPU/RAM)</w:t>
+      </w:r>
+    </w:p>
+    <w:p>
+      <w:pPr>
+        <w:spacing w:before="200" w:after="80"/>
+      </w:pPr>
+      <w:r>
+        <w:rPr>
+          <w:b/>
+          <w:color w:val="2C3E50"/>
+          <w:sz w:val="22"/>
+        </w:rPr>
+        <w:t>🔵 Correctifs Grafana — Alertes</w:t>
+      </w:r>
+    </w:p>
+    <w:p>
+      <w:pPr>
+        <w:spacing w:after="160"/>
+        <w:ind w:left="432"/>
+      </w:pPr>
+      <w:r>
+        <w:t>Le message 'Unknown state execution_error' est résolu : le paramètre execErrState est passé de 'Error' à 'Alerting' dans toutes les règles d'alerte. Le panneau d'alertes affiche maintenant correctement les 5 règles configurées (Concept Drift détecté, Drift confirmé, Taux fake &gt;70 %, Taux fake &gt;40 %, Confiance modèle faible &lt;70 %).</w:t>
+      </w:r>
+    </w:p>
+    <w:p>
+      <w:pPr>
+        <w:spacing w:before="200" w:after="80"/>
+      </w:pPr>
+      <w:r>
+        <w:rPr>
+          <w:b/>
+          <w:color w:val="2C3E50"/>
+          <w:sz w:val="22"/>
+        </w:rPr>
+        <w:t>🔵 Contexte africain renforcé</w:t>
+      </w:r>
+    </w:p>
+    <w:p>
+      <w:pPr>
+        <w:spacing w:after="160"/>
+        <w:ind w:left="432"/>
+      </w:pPr>
+      <w:r>
+        <w:t>La documentation et l'interface Streamlit (page À propos) soulignent explicitement le déploiement en contexte africain (Afrique subsaharienne). Les sources prioritaires sont AFP Afrique, RFI, Jeune Afrique, Al Jazeera, France24, VOA News Africa. L'architecture est universelle et exportable hors d'Afrique.</w:t>
+      </w:r>
+    </w:p>
+    <w:p>
+      <w:r>
+        <w:br w:type="page"/>
+      </w:r>
+    </w:p>
+    <w:p>
+      <w:pPr>
+        <w:pStyle w:val="Heading1"/>
+      </w:pPr>
+      <w:r>
+        <w:rPr>
+          <w:b/>
+          <w:color w:val="1A537E"/>
+          <w:sz w:val="28"/>
+        </w:rPr>
+        <w:t>Mises à jour Version 2.0</w:t>
+      </w:r>
+    </w:p>
+    <w:p>
+      <w:pPr>
+        <w:spacing w:after="240"/>
+      </w:pPr>
+      <w:r>
+        <w:t>Les modifications suivantes ont été apportées au projet dans le cadre de la version 2.0 (avril 2026). Elles améliorent la robustesse du modèle, l'accessibilité de l'interface et l'optimisation des ressources.</w:t>
+      </w:r>
+    </w:p>
+    <w:p>
+      <w:pPr>
+        <w:spacing w:before="200" w:after="80"/>
+      </w:pPr>
+      <w:r>
+        <w:rPr>
+          <w:b/>
+          <w:color w:val="2C3E50"/>
+          <w:sz w:val="22"/>
+        </w:rPr>
+        <w:t>🔵 Équilibrage du dataset d'entraînement</w:t>
+      </w:r>
+    </w:p>
+    <w:p>
+      <w:pPr>
+        <w:spacing w:after="160"/>
+        <w:ind w:left="432"/>
+      </w:pPr>
+      <w:r>
+        <w:t>Le corpus est désormais sous-échantillonné pour garantir 50 % d'articles faux et 50 % d'articles vrais avant entraînement. Le split est passé de 80/10/10 à 60/20/20 (train/validation/test). Un WeightedRandomSampler assure des mini-batchs équilibrés même en cas de légère imbalance résiduelle.</w:t>
+      </w:r>
+    </w:p>
+    <w:p>
+      <w:pPr>
+        <w:spacing w:before="200" w:after="80"/>
+      </w:pPr>
+      <w:r>
+        <w:rPr>
+          <w:b/>
+          <w:color w:val="2C3E50"/>
+          <w:sz w:val="22"/>
+        </w:rPr>
+        <w:t>🔵 Reservoir d'apprentissage continu équilibré par classe</w:t>
+      </w:r>
+    </w:p>
+    <w:p>
+      <w:pPr>
+        <w:spacing w:after="160"/>
+        <w:ind w:left="432"/>
+      </w:pPr>
+      <w:r>
+        <w:t>Le buffer de replay (Reservoir Sampling) est maintenant divisé en deux sous-buffers indépendants : 2 500 exemples faux + 2 500 exemples vrais. Même lors d'injections massives de désinformation (concept drift, scénario B), le modèle conserve un ratio fake/réel de 50/50 lors de la mise à jour en ligne.</w:t>
+      </w:r>
+    </w:p>
+    <w:p>
+      <w:pPr>
+        <w:spacing w:before="200" w:after="80"/>
+      </w:pPr>
+      <w:r>
+        <w:rPr>
+          <w:b/>
+          <w:color w:val="2C3E50"/>
+          <w:sz w:val="22"/>
+        </w:rPr>
+        <w:t>🔵 Poids de classe corrigés dans la loss en ligne</w:t>
+      </w:r>
+    </w:p>
+    <w:p>
+      <w:pPr>
+        <w:spacing w:after="160"/>
+        <w:ind w:left="432"/>
+      </w:pPr>
+      <w:r>
+        <w:t>La fonction de perte CrossEntropyLoss utilise désormais des poids inversement proportionnels à la fréquence de chaque classe dans le mini-batch. La classe minoritaire reçoit plus de signal, empêchant le modèle de se spécialiser uniquement dans la détection des faux articles.</w:t>
+      </w:r>
+    </w:p>
+    <w:p>
+      <w:pPr>
+        <w:spacing w:before="200" w:after="80"/>
+      </w:pPr>
+      <w:r>
+        <w:rPr>
+          <w:b/>
+          <w:color w:val="2C3E50"/>
+          <w:sz w:val="22"/>
+        </w:rPr>
+        <w:t>🔵 Port Spark UI exposé (port 4040)</w:t>
+      </w:r>
+    </w:p>
+    <w:p>
+      <w:pPr>
+        <w:spacing w:after="160"/>
+        <w:ind w:left="432"/>
+      </w:pPr>
+      <w:r>
+        <w:t>L'interface web de monitoring Apache Spark est maintenant accessible sur le port 4040. Elle permet de visualiser les jobs Spark Streaming en cours, les DAG d'exécution, les statistiques de traitement et les métriques des micro-batchs en temps réel.</w:t>
+      </w:r>
+    </w:p>
+    <w:p>
+      <w:pPr>
+        <w:spacing w:before="200" w:after="80"/>
+      </w:pPr>
+      <w:r>
+        <w:rPr>
+          <w:b/>
+          <w:color w:val="2C3E50"/>
+          <w:sz w:val="22"/>
+        </w:rPr>
+        <w:t>🔵 Optimisation mémoire — machine 12 GB RAM</w:t>
+      </w:r>
+    </w:p>
+    <w:p>
+      <w:pPr>
+        <w:spacing w:after="160"/>
+        <w:ind w:left="432"/>
+      </w:pPr>
+      <w:r>
+        <w:t>La consommation mémoire totale a été réduite de ~2.3 GB pour permettre l'ouverture d'un navigateur (Firefox) pendant l'exécution du pipeline :</w:t>
+        <w:br/>
+        <w:t>• Spark driver JVM : 1 500 m → 1 200 m (-300 MB)</w:t>
+        <w:br/>
+        <w:t>• Spark container limit : 4 GB → 3 GB (-1 GB)</w:t>
+        <w:br/>
+        <w:t>• Elasticsearch JVM : 384 m → 256 m (-128 MB)</w:t>
+        <w:br/>
+        <w:t>• Elasticsearch container : 768 M → 512 M (-256 MB)</w:t>
+        <w:br/>
+        <w:t>• Drift injector interval : 15 min → 30 min (-50 % pression CPU/RAM)</w:t>
+      </w:r>
+    </w:p>
+    <w:p>
+      <w:pPr>
+        <w:spacing w:before="200" w:after="80"/>
+      </w:pPr>
+      <w:r>
+        <w:rPr>
+          <w:b/>
+          <w:color w:val="2C3E50"/>
+          <w:sz w:val="22"/>
+        </w:rPr>
+        <w:t>🔵 Correctifs Grafana — Alertes</w:t>
+      </w:r>
+    </w:p>
+    <w:p>
+      <w:pPr>
+        <w:spacing w:after="160"/>
+        <w:ind w:left="432"/>
+      </w:pPr>
+      <w:r>
+        <w:t>Le message 'Unknown state execution_error' est résolu : le paramètre execErrState est passé de 'Error' à 'Alerting' dans toutes les règles d'alerte. Le panneau d'alertes affiche maintenant correctement les 5 règles configurées (Concept Drift détecté, Drift confirmé, Taux fake &gt;70 %, Taux fake &gt;40 %, Confiance modèle faible &lt;70 %).</w:t>
+      </w:r>
+    </w:p>
+    <w:p>
+      <w:pPr>
+        <w:spacing w:before="200" w:after="80"/>
+      </w:pPr>
+      <w:r>
+        <w:rPr>
+          <w:b/>
+          <w:color w:val="2C3E50"/>
+          <w:sz w:val="22"/>
+        </w:rPr>
+        <w:t>🔵 Contexte africain renforcé</w:t>
+      </w:r>
+    </w:p>
+    <w:p>
+      <w:pPr>
+        <w:spacing w:after="160"/>
+        <w:ind w:left="432"/>
+      </w:pPr>
+      <w:r>
+        <w:t>La documentation et l'interface Streamlit (page À propos) soulignent explicitement le déploiement en contexte africain (Afrique subsaharienne). Les sources prioritaires sont AFP Afrique, RFI, Jeune Afrique, Al Jazeera, France24, VOA News Africa. L'architecture est universelle et exportable hors d'Afrique.</w:t>
       </w:r>
     </w:p>
     <w:sectPr>

</xml_diff>

<commit_message>
Documents v2.1 : recherche web temps réel, Grafana, Spark G1GC, RSS
</commit_message>
<xml_diff>
--- a/Memoire_Master2_IBDIA_KOMOSSI_Sosso_v5.docx
+++ b/Memoire_Master2_IBDIA_KOMOSSI_Sosso_v5.docx
@@ -52991,6 +52991,266 @@
       </w:pPr>
       <w:r>
         <w:t>La documentation et l'interface Streamlit (page À propos) soulignent explicitement le déploiement en contexte africain (Afrique subsaharienne). Les sources prioritaires sont AFP Afrique, RFI, Jeune Afrique, Al Jazeera, France24, VOA News Africa. L'architecture est universelle et exportable hors d'Afrique.</w:t>
+      </w:r>
+    </w:p>
+    <w:p>
+      <w:r>
+        <w:br w:type="page"/>
+      </w:r>
+    </w:p>
+    <w:p>
+      <w:pPr>
+        <w:pStyle w:val="Heading1"/>
+      </w:pPr>
+      <w:r>
+        <w:rPr>
+          <w:b/>
+          <w:color w:val="1A537E"/>
+          <w:sz w:val="28"/>
+        </w:rPr>
+        <w:t>Mises à jour Version 2.1</w:t>
+      </w:r>
+    </w:p>
+    <w:p>
+      <w:pPr>
+        <w:spacing w:after="240"/>
+      </w:pPr>
+      <w:r>
+        <w:t>La version 2.1 (avril 2026) apporte la fonctionnalité de recherche web en temps réel avec classification instantanée, corrige la stabilité long-terme de Spark, améliore le monitoring Grafana et renforce la résilience du pipeline.</w:t>
+      </w:r>
+    </w:p>
+    <w:p>
+      <w:pPr>
+        <w:spacing w:before="200" w:after="80"/>
+      </w:pPr>
+      <w:r>
+        <w:rPr>
+          <w:b/>
+          <w:color w:val="2C3E50"/>
+          <w:sz w:val="22"/>
+        </w:rPr>
+        <w:t>🟢 Recherche Web temps réel — Nouveau endpoint API</w:t>
+      </w:r>
+    </w:p>
+    <w:p>
+      <w:pPr>
+        <w:spacing w:after="160"/>
+        <w:ind w:left="432"/>
+      </w:pPr>
+      <w:r>
+        <w:t>Ajout de GET /api/v1/search/web : recherche d'articles d'actualité sur internet avec classification immédiate par le modèle DistilBERT ONNX INT8.</w:t>
+        <w:br/>
+        <w:t>• Source primaire : Google News RSS (gratuit, sans clé API, aucun rate-limit agressif)</w:t>
+        <w:br/>
+        <w:t>• Source secondaire (fallback) : DuckDuckGo News</w:t>
+        <w:br/>
+        <w:t>• Inférence ONNX directe dans l'API — résultats en &lt; 10 ms/article</w:t>
+        <w:br/>
+        <w:t>• Les articles sont aussi publiés vers Kafka pour l'apprentissage continu de Spark</w:t>
+        <w:br/>
+        <w:t>• Persistance MongoDB des résultats classifiés</w:t>
+        <w:br/>
+        <w:t>• Cache in-memory 5 minutes : la même requête ne ré-interroge pas le web</w:t>
+        <w:br/>
+        <w:t>• Mécanisme anti-ratelimit DuckDuckGo : délai minimum 4 s entre appels, retry 3× avec backoff 5 s / 20 s / 45 s</w:t>
+        <w:br/>
+        <w:t>• Endpoint complémentaire : GET /api/v1/search/web/sources</w:t>
+      </w:r>
+    </w:p>
+    <w:p>
+      <w:pPr>
+        <w:spacing w:before="200" w:after="80"/>
+      </w:pPr>
+      <w:r>
+        <w:rPr>
+          <w:b/>
+          <w:color w:val="2C3E50"/>
+          <w:sz w:val="22"/>
+        </w:rPr>
+        <w:t>🟢 Interface Streamlit — Page Recherche refontée (2 onglets)</w:t>
+      </w:r>
+    </w:p>
+    <w:p>
+      <w:pPr>
+        <w:spacing w:after="160"/>
+        <w:ind w:left="432"/>
+      </w:pPr>
+      <w:r>
+        <w:t>La page Recherche du dashboard Streamlit est maintenant organisée en deux onglets :</w:t>
+        <w:br/>
+        <w:t>• Onglet 1 — 🌐 Recherche Web en direct : saisie libre → Google News RSS → classification ONNX instantanée → badges FAKE/RÉEL + score de confiance + liens cliquables vers les articles originaux + graphique des probabilités + export CSV. Sujets suggérés contextualisés pour l'Afrique.</w:t>
+        <w:br/>
+        <w:t>• Onglet 2 — 🗄️ Base de données : recherche full-text Elasticsearch sur les articles déjà indexés, avec scatter plot de pertinence.</w:t>
+        <w:br/>
+        <w:t>Les articles web analysés enrichissent automatiquement l'apprentissage du modèle.</w:t>
+      </w:r>
+    </w:p>
+    <w:p>
+      <w:pPr>
+        <w:spacing w:before="200" w:after="80"/>
+      </w:pPr>
+      <w:r>
+        <w:rPr>
+          <w:b/>
+          <w:color w:val="2C3E50"/>
+          <w:sz w:val="22"/>
+        </w:rPr>
+        <w:t>🟢 Architecture API enrichie — ONNX dans le container API</w:t>
+      </w:r>
+    </w:p>
+    <w:p>
+      <w:pPr>
+        <w:spacing w:after="160"/>
+        <w:ind w:left="432"/>
+      </w:pPr>
+      <w:r>
+        <w:t>Le container API embarque désormais le runtime d'inférence ML :</w:t>
+        <w:br/>
+        <w:t>• onnxruntime==1.19.2 installé dans l'image Docker API</w:t>
+        <w:br/>
+        <w:t>• transformers==4.44.2 + tokenizers==0.19.1 pour le tokenizer DistilBERT</w:t>
+        <w:br/>
+        <w:t>• Volume ./models/onnx monté en lecture seule dans le container API</w:t>
+        <w:br/>
+        <w:t>• Chargement lazy du modèle (une seule fois au premier appel /search/web)</w:t>
+        <w:br/>
+        <w:t>• 1 worker uvicorn au lieu de 2 (évite double chargement ONNX 130MB → OOM)</w:t>
+        <w:br/>
+        <w:t>• Mémoire container API : 256 MB → 768 MB pour accueillir le runtime ONNX</w:t>
+      </w:r>
+    </w:p>
+    <w:p>
+      <w:pPr>
+        <w:spacing w:before="200" w:after="80"/>
+      </w:pPr>
+      <w:r>
+        <w:rPr>
+          <w:b/>
+          <w:color w:val="2C3E50"/>
+          <w:sz w:val="22"/>
+        </w:rPr>
+        <w:t>🟢 Correctif Grafana — Plage temporelle et performances</w:t>
+      </w:r>
+    </w:p>
+    <w:p>
+      <w:pPr>
+        <w:spacing w:after="160"/>
+        <w:ind w:left="432"/>
+      </w:pPr>
+      <w:r>
+        <w:t>Résolution du problème 'No Data' sur tous les panels Grafana :</w:t>
+        <w:br/>
+        <w:t>• Plage par défaut : now-1h → now-24h (les données sont bien présentes)</w:t>
+        <w:br/>
+        <w:t>• Refresh automatique : 5 s → 30 s (réduit la charge CPU sur machine 12 GB)</w:t>
+        <w:br/>
+        <w:t>• Timepicker enrichi : options 1h, 3h, 6h, 12h, 24h, 2j, 7j, 30j</w:t>
+        <w:br/>
+        <w:t>• Cause identifiée : avec Spark traitant des batches toutes les ~15 min, la fenêtre 1h était souvent vide entre deux batches</w:t>
+      </w:r>
+    </w:p>
+    <w:p>
+      <w:pPr>
+        <w:spacing w:before="200" w:after="80"/>
+      </w:pPr>
+      <w:r>
+        <w:rPr>
+          <w:b/>
+          <w:color w:val="2C3E50"/>
+          <w:sz w:val="22"/>
+        </w:rPr>
+        <w:t>🟢 Stabilisation Spark — Correctif crash Py4JError (OOM JVM)</w:t>
+      </w:r>
+    </w:p>
+    <w:p>
+      <w:pPr>
+        <w:spacing w:after="160"/>
+        <w:ind w:left="432"/>
+      </w:pPr>
+      <w:r>
+        <w:t>Résolution du crash Spark 'Py4JError: An error occurred while calling awaitTermination' survenant après 12+ heures de fonctionnement :</w:t>
+        <w:br/>
+        <w:t>• Cause : la JVM (Java Virtual Machine) atteignait l'OOM (Out of Memory) par accumulation de garbage non collecté avec le GC par défaut (Parallel GC)</w:t>
+        <w:br/>
+        <w:t>• Correction : activation du G1GC (Garbage First Garbage Collector) :</w:t>
+        <w:br/>
+        <w:t xml:space="preserve">  -XX:+UseG1GC -XX:G1HeapRegionSize=4m -XX:MaxGCPauseMillis=500</w:t>
+        <w:br/>
+        <w:t xml:space="preserve">  -XX:InitiatingHeapOccupancyPercent=35 -XX:+ExplicitGCInvokesConcurrent</w:t>
+        <w:br/>
+        <w:t>• maxOffsetsPerTrigger : 1 000 → 200 (batches plus légers, moins de pression mémoire)</w:t>
+        <w:br/>
+        <w:t>• Impact : Spark fonctionne maintenant en continu sans crash</w:t>
+      </w:r>
+    </w:p>
+    <w:p>
+      <w:pPr>
+        <w:spacing w:before="200" w:after="80"/>
+      </w:pPr>
+      <w:r>
+        <w:rPr>
+          <w:b/>
+          <w:color w:val="2C3E50"/>
+          <w:sz w:val="22"/>
+        </w:rPr>
+        <w:t>🟢 RSS Producer — Résilience et continuité du flux de données</w:t>
+      </w:r>
+    </w:p>
+    <w:p>
+      <w:pPr>
+        <w:spacing w:after="160"/>
+        <w:ind w:left="432"/>
+      </w:pPr>
+      <w:r>
+        <w:t>Amélioration de la continuité du flux RSS vers Kafka :</w:t>
+        <w:br/>
+        <w:t>• Identification du problème : après 5-6 jours sans redémarrage, tous les articles RSS sont dédupliqués (seen_ids set) et le producer envoie 0 article/cycle</w:t>
+        <w:br/>
+        <w:t>• Solution : redémarrage périodique du container pour réinitialiser le cache</w:t>
+        <w:br/>
+        <w:t>• Au redémarrage : envoi immédiat de ~150 articles (12 sources × 20 articles max)</w:t>
+        <w:br/>
+        <w:t>• Spark reprend le traitement dans les 5 minutes suivant le redémarrage du producer</w:t>
+      </w:r>
+    </w:p>
+    <w:p>
+      <w:pPr>
+        <w:spacing w:before="200" w:after="80"/>
+      </w:pPr>
+      <w:r>
+        <w:rPr>
+          <w:b/>
+          <w:color w:val="2C3E50"/>
+          <w:sz w:val="22"/>
+        </w:rPr>
+        <w:t>🟢 Performances v2.1 — Métriques mises à jour</w:t>
+      </w:r>
+    </w:p>
+    <w:p>
+      <w:pPr>
+        <w:spacing w:after="160"/>
+        <w:ind w:left="432"/>
+      </w:pPr>
+      <w:r>
+        <w:t>Résultats du modèle Continual-DistilBERT v2.1 (après correction du biais) :</w:t>
+        <w:br/>
+        <w:t>• F1-score macro (validation) : 98.49 % (amélioration vs 93.2 % initial)</w:t>
+        <w:br/>
+        <w:t>• F1-score classe réel (0) : ≥ 88 % (objectif early stopping)</w:t>
+        <w:br/>
+        <w:t>• F1-score classe fake (1) : ≥ 88 % (objectif early stopping)</w:t>
+        <w:br/>
+        <w:t>• AUC-ROC : 99.89 %</w:t>
+        <w:br/>
+        <w:t>• Latence inférence ONNX INT8 : ~5-6 ms/article (Spark) / &lt; 10 ms (API web search)</w:t>
+        <w:br/>
+        <w:t>• Taux de compression FP32 → INT8 : ~75 %</w:t>
+        <w:br/>
+        <w:t>• Débit pipeline : ~200 articles/batch/5 s</w:t>
+        <w:br/>
+        <w:t>• Articles traités au 30 avril 2026 : &gt; 10 000</w:t>
+        <w:br/>
+        <w:t>• Taux de fake détecté en production : ~87-94 % (drift injector actif)</w:t>
       </w:r>
     </w:p>
     <w:sectPr>

</xml_diff>

<commit_message>
Documents v2.2 : optimisations Spark, TTL RSS, monitoring Grafana temps réel
</commit_message>
<xml_diff>
--- a/Memoire_Master2_IBDIA_KOMOSSI_Sosso_v5.docx
+++ b/Memoire_Master2_IBDIA_KOMOSSI_Sosso_v5.docx
@@ -53251,6 +53251,170 @@
         <w:t>• Articles traités au 30 avril 2026 : &gt; 10 000</w:t>
         <w:br/>
         <w:t>• Taux de fake détecté en production : ~87-94 % (drift injector actif)</w:t>
+      </w:r>
+    </w:p>
+    <w:p>
+      <w:r>
+        <w:br w:type="page"/>
+      </w:r>
+    </w:p>
+    <w:p>
+      <w:pPr>
+        <w:spacing w:before="320" w:after="160"/>
+      </w:pPr>
+      <w:r>
+        <w:rPr>
+          <w:b/>
+          <w:color w:val="1A537E"/>
+          <w:sz w:val="32"/>
+        </w:rPr>
+        <w:t>Mises à jour Version 2.2</w:t>
+      </w:r>
+    </w:p>
+    <w:p>
+      <w:pPr>
+        <w:spacing w:after="240"/>
+      </w:pPr>
+      <w:r>
+        <w:t>La version 2.2 (avril 2026) résout le blocage du monitoring Grafana causé par la saturation mémoire de Spark et le swap excessif. Les batches passent de 17-20 minutes à 30-35 secondes grâce à l'entraînement conditionnel, SGD optimisé et la correction de la déduplication RSS.</w:t>
+      </w:r>
+    </w:p>
+    <w:p>
+      <w:pPr>
+        <w:spacing w:before="200" w:after="80"/>
+      </w:pPr>
+      <w:r>
+        <w:rPr>
+          <w:b/>
+          <w:color w:val="2C3E50"/>
+          <w:sz w:val="22"/>
+        </w:rPr>
+        <w:t>🟡 Résolution du blocage Grafana — Pipeline ralenti par saturation mémoire</w:t>
+      </w:r>
+    </w:p>
+    <w:p>
+      <w:pPr>
+        <w:spacing w:after="160"/>
+        <w:ind w:left="432"/>
+      </w:pPr>
+      <w:r>
+        <w:t>Diagnostic : le container Spark consommait 3 GiB / 3 GiB (100 % de sa limite mémoire). Le système utilisait 3.4 GiB de swap sur disque USB externe (30 MB/s), rendant chaque batch Spark de 197 articles 17 à 20 minutes. Grafana recevait de nouvelles données seulement toutes les 20 minutes.</w:t>
+        <w:br/>
+        <w:t>Corrections apportées :</w:t>
+        <w:br/>
+        <w:t>• Mémoire Spark : 3 G → 3.5 G dans docker-compose.yml (headroom suffisant)</w:t>
+        <w:br/>
+        <w:t>• Mode eval/train PyTorch séparé : pt_model.eval() entre les entraînements</w:t>
+        <w:br/>
+        <w:t>• Softmax ONNX en pur numpy (zéro tenseur PyTorch dans la boucle d'inférence)</w:t>
+        <w:br/>
+        <w:t>Résultat : 2.28 GiB / 3.42 GiB (67 %), plus aucun swap sur le chemin critique.</w:t>
+      </w:r>
+    </w:p>
+    <w:p>
+      <w:pPr>
+        <w:spacing w:before="200" w:after="80"/>
+      </w:pPr>
+      <w:r>
+        <w:rPr>
+          <w:b/>
+          <w:color w:val="2C3E50"/>
+          <w:sz w:val="22"/>
+        </w:rPr>
+        <w:t>🟡 Entraînement continu optimisé — 1 entraînement tous les 5 batches</w:t>
+      </w:r>
+    </w:p>
+    <w:p>
+      <w:pPr>
+        <w:spacing w:after="160"/>
+        <w:ind w:left="432"/>
+      </w:pPr>
+      <w:r>
+        <w:t>Le PyTorch DistilBERT (66M paramètres) + SGD (momentum) totalise ~528 MB de données PyTorch. L'entraînement à chaque batch causait 248s de chargement depuis le swap. Solution : variable d'environnement ONLINE_TRAIN_EVERY_N (défaut 5).</w:t>
+        <w:br/>
+        <w:t>• Batches 1-4 : inference seule = 30-35s/batch</w:t>
+        <w:br/>
+        <w:t>• Batch 5 (entraînement) : ~248s</w:t>
+        <w:br/>
+        <w:t>• Temps moyen : ~76s/batch (vs 17-20 min avant)</w:t>
+        <w:br/>
+        <w:t>• L'apprentissage continu reste actif mais n'impacte plus le flux temps réel.</w:t>
+      </w:r>
+    </w:p>
+    <w:p>
+      <w:pPr>
+        <w:spacing w:before="200" w:after="80"/>
+      </w:pPr>
+      <w:r>
+        <w:rPr>
+          <w:b/>
+          <w:color w:val="2C3E50"/>
+          <w:sz w:val="22"/>
+        </w:rPr>
+        <w:t>🟡 Remplacement AdamW par SGD (momentum) — économie 264 MB</w:t>
+      </w:r>
+    </w:p>
+    <w:p>
+      <w:pPr>
+        <w:spacing w:after="160"/>
+        <w:ind w:left="432"/>
+      </w:pPr>
+      <w:r>
+        <w:t>AdamW stockait deux moments (m et v) soit 2 × 264 MB = 528 MB d'état optimizer. Remplacement par SGD avec momentum (1 seul vecteur momentum = 264 MB). Économie : 264 MB de RAM permanente dans le container Spark. La qualité de l'apprentissage en ligne est maintenue grâce au momentum SGD (0.9).</w:t>
+      </w:r>
+    </w:p>
+    <w:p>
+      <w:pPr>
+        <w:spacing w:before="200" w:after="80"/>
+      </w:pPr>
+      <w:r>
+        <w:rPr>
+          <w:b/>
+          <w:color w:val="2C3E50"/>
+          <w:sz w:val="22"/>
+        </w:rPr>
+        <w:t>🟡 RSS Producer — Cache de déduplication avec TTL 2 heures</w:t>
+      </w:r>
+    </w:p>
+    <w:p>
+      <w:pPr>
+        <w:spacing w:after="160"/>
+        <w:ind w:left="432"/>
+      </w:pPr>
+      <w:r>
+        <w:t>Problème : le set seen_ids (set Python infini) retenait tous les IDs vus depuis le démarrage. Après le premier cycle (151 articles), 0 article était envoyé pendant des heures. Solution : remplacement du set par un dict {id: timestamp} avec TTL de 7200s (variable RSS_DEDUP_TTL_SEC). Les articles plus vieux que 2h expirent et peuvent être renvoyés vers Kafka pour alimenter le pipeline d'apprentissage continu. MongoDB et Elasticsearch utilisent l'upsert — aucun doublon en base.</w:t>
+      </w:r>
+    </w:p>
+    <w:p>
+      <w:pPr>
+        <w:spacing w:before="200" w:after="80"/>
+      </w:pPr>
+      <w:r>
+        <w:rPr>
+          <w:b/>
+          <w:color w:val="2C3E50"/>
+          <w:sz w:val="22"/>
+        </w:rPr>
+        <w:t>🟡 Monitoring temps réel restauré — Grafana alimenté toutes les 30-60 s</w:t>
+      </w:r>
+    </w:p>
+    <w:p>
+      <w:pPr>
+        <w:spacing w:after="160"/>
+        <w:ind w:left="432"/>
+      </w:pPr>
+      <w:r>
+        <w:t>Avec les optimisations v2.2, le pipeline fonctionne désormais en quasi-temps réel :</w:t>
+        <w:br/>
+        <w:t>• Spark traite ~100 articles toutes les 30-35s (batches sans entraînement)</w:t>
+        <w:br/>
+        <w:t>• Grafana (refresh 30s) affiche les nouvelles données à chaque cycle</w:t>
+        <w:br/>
+        <w:t>• ~300 articles indexés par heure en production normale</w:t>
+        <w:br/>
+        <w:t>• Résultat diagnostiqué par profiling : collect=1s, inference=28s, train=0s</w:t>
+        <w:br/>
+        <w:t>• Les logs de timing (collect=, boucle inference=, train=) sont conservés pour permettre la surveillance continue des performances.</w:t>
       </w:r>
     </w:p>
     <w:sectPr>

</xml_diff>

<commit_message>
Mode démonstration Streamlit Cloud + mise à jour documents v2.3
- app.py : données de démonstration complètes en mode cloud (IS_CLOUD=True)
  * 20 articles réalistes (AFP, Reuters, BBC, RFI + faux détectés)
  * Tendance horaire 24h, 3 événements de drift simulés
  * Recherche web avec classification visuelle (graphique + détails)
  * fetch_stats/health/articles/virality/drift retournent les données démo
- Documents v2.3 : seuil 0.65, compatibilité Python 3.14, migration Docker
</commit_message>
<xml_diff>
--- a/Memoire_Master2_IBDIA_KOMOSSI_Sosso_v5.docx
+++ b/Memoire_Master2_IBDIA_KOMOSSI_Sosso_v5.docx
@@ -53415,6 +53415,48 @@
         <w:t>• Résultat diagnostiqué par profiling : collect=1s, inference=28s, train=0s</w:t>
         <w:br/>
         <w:t>• Les logs de timing (collect=, boucle inference=, train=) sont conservés pour permettre la surveillance continue des performances.</w:t>
+      </w:r>
+    </w:p>
+    <w:p>
+      <w:r>
+        <w:t>Mises à jour Version 2.3</w:t>
+      </w:r>
+    </w:p>
+    <w:p>
+      <w:r>
+        <w:t>La version 2.3 (juillet 2026) apporte trois corrections importantes identifiées lors de la phase de tests et de déploiement cloud : réduction des faux positifs de classification, compatibilité Streamlit Cloud, et stabilisation des containers Docker après migration.</w:t>
+      </w:r>
+    </w:p>
+    <w:p>
+      <w:r>
+        <w:t>🔵 Correction des faux positifs — Seuil de décision relevé à 0.65</w:t>
+      </w:r>
+    </w:p>
+    <w:p>
+      <w:r>
+        <w:t>Des sources d'information officielles (AFP, Reuters, BBC, RFI) étaient erronément classifiées comme fausses (is_fake=1). Analyse de la cause : décalage de domaine entre les corpus d'entraînement américains (ISOT, WELFake, LIAR, FakeNewsNet) et les flux RSS africains/francophones. Les courtes dépêches d'agence contenant des termes sensibles (« coup d'État », « vaccination », « accord de paix ») dépassaient le seuil p_fake=0.50.</w:t>
+        <w:br/>
+        <w:t>Correction appliquée dans nlp_classifier.py et web_search.py : le seuil est relevé à p_fake ≥ 0.65. Un article est désormais qualifié de désinformation uniquement si la probabilité assignée par le modèle DistilBERT ONNX dépasse 65 %, ce qui réduit significativement les faux positifs sur les dépêches officielles tout en conservant une sensibilité élevée aux vraies désinformations.</w:t>
+      </w:r>
+    </w:p>
+    <w:p>
+      <w:r>
+        <w:t>🔵 Compatibilité Streamlit Cloud — Python 3.14</w:t>
+      </w:r>
+    </w:p>
+    <w:p>
+      <w:r>
+        <w:t>L'environnement Streamlit Cloud utilise Python 3.14.6. Les packages épinglés à des versions sans wheel Python 3.14 (pillow==10.4.0) échouaient à la compilation depuis les sources (dépendance zlib manquante). Solution : toutes les contraintes de version sont converties en bornes inférieures (&gt;=), et pillow est retiré du requirements.txt car il est automatiquement installé par streamlit dans une version compatible. L'application intègre un mode démonstration activé automatiquement en environnement cloud (variable IS_CLOUD) pour désactiver les appels vers les services locaux (Kafka, MongoDB, FastAPI) non disponibles.</w:t>
+      </w:r>
+    </w:p>
+    <w:p>
+      <w:r>
+        <w:t>🔵 Stabilisation Docker — Migration de volume après changement de disque</w:t>
+      </w:r>
+    </w:p>
+    <w:p>
+      <w:r>
+        <w:t>Après déplacement du projet du disque local5 vers le disque local6, quatre containers (spark-app, api, rss-producer, drift-injector) conservaient les anciens chemins de montage (bind mounts) et échouaient au démarrage avec des erreurs « No such file or directory ». Correction : arrêt et suppression des containers via docker compose stop + rm, puis recréation par docker compose up -d. Les volumes nommés Docker (mongodb_data, elasticsearch_data, kafka_data, grafana_data) n'ont pas été supprimés et aucune donnée n'a été perdue.</w:t>
       </w:r>
     </w:p>
     <w:sectPr>

</xml_diff>

<commit_message>
Corrige le bug critique de format d'entrée en recherche web, décontamine les stats drift, ajoute la fenêtre de visualisation/récupération auto du drift, enrichit le corpus africain et fiabilise l'entraînement
- web_search.py : reproduit exactement le format d'entraînement "{title} [SEP] {body}" (bug causant un taux de fake anormalement élevé)
- Décontamination MongoDB/Elasticsearch + drift-injector désactivé par défaut (docker-compose.yml)
- Seuil de classification relevé à 0.75 (nlp_classifier.py, web_search.py)
- Cycle drift → fenêtre de visualisation (1-10 min) → retour automatique à la normale (inject_drift_simulation.py, drift.py, app.py)
- Enrichissement du corpus africain via MasakhaNEWS (download_african_datasets.py), africa_boost dans train_model.py
- Reprise sur checkpoint pour l'entraînement CPU longue durée (résilience aux coupures disque)
- Mise à jour des documents .docx (v2.4) + export PDF

Co-Authored-By: Claude Sonnet 5 <noreply@anthropic.com>
</commit_message>
<xml_diff>
--- a/Memoire_Master2_IBDIA_KOMOSSI_Sosso_v5.docx
+++ b/Memoire_Master2_IBDIA_KOMOSSI_Sosso_v5.docx
@@ -53457,6 +53457,109 @@
     <w:p>
       <w:r>
         <w:t>Après déplacement du projet du disque local5 vers le disque local6, quatre containers (spark-app, api, rss-producer, drift-injector) conservaient les anciens chemins de montage (bind mounts) et échouaient au démarrage avec des erreurs « No such file or directory ». Correction : arrêt et suppression des containers via docker compose stop + rm, puis recréation par docker compose up -d. Les volumes nommés Docker (mongodb_data, elasticsearch_data, kafka_data, grafana_data) n'ont pas été supprimés et aucune donnée n'a été perdue.</w:t>
+      </w:r>
+    </w:p>
+    <w:p/>
+    <w:p>
+      <w:pPr/>
+      <w:r>
+        <w:t>Mises à jour Version 2.4</w:t>
+      </w:r>
+    </w:p>
+    <w:p>
+      <w:r>
+        <w:t>La version 2.4 (juillet 2026) corrige un bug critique responsable d'un taux de fake anormalement élevé sur la recherche web, décontamine les statistiques polluées par des données de simulation, renforce le contexte africain multilingue du corpus d'entraînement, et introduit un cycle de dérive non permanent (fenêtre de visualisation puis retour automatique à la normale).</w:t>
+      </w:r>
+    </w:p>
+    <w:p>
+      <w:r>
+        <w:rPr>
+          <w:b/>
+        </w:rPr>
+        <w:t>🔴 Bug critique corrigé — désynchronisation du format d'entrée en recherche web</w:t>
+      </w:r>
+    </w:p>
+    <w:p>
+      <w:r>
+        <w:t>Diagnostic : api/src/routers/web_search.py construisait le texte à classifier par simple concaténation ("{title} {body}"), alors que l'entraînement (scripts/train_model.py) et le classifieur Spark (spark-app/src/nlp_classifier.py) utilisent le format "{title[:200]} [SEP] {body[:100]}". Cette divergence plaçait chaque recherche web hors de la distribution d'entraînement du modèle. Vérification empirique sur un même article réel de l'AFP : p_fake = 6,6 % avec le format d'entraînement contre 60,1 % avec l'ancien format de web_search.py. Correction : web_search.py reproduit désormais exactement le format d'entraînement.</w:t>
+      </w:r>
+    </w:p>
+    <w:p>
+      <w:r>
+        <w:rPr>
+          <w:b/>
+        </w:rPr>
+        <w:t>🔴 Décontamination MongoDB / Elasticsearch — statistiques faussées depuis des semaines</w:t>
+      </w:r>
+    </w:p>
+    <w:p>
+      <w:r>
+        <w:t>L'ancien service drift-injector tournait en mode démon 24/7 (toutes les 30 min), injectant des articles majoritairement fake (jusqu'à 90 %) en continu depuis des semaines. Résultat : 16 229 des 19 576 documents de la collection MongoDB (83 %) et autant sur Elasticsearch étaient des artefacts de simulation (sources synthétiques 'InfoBrûlante', 'VéritéCachée', 'AlerteComplot', etc., identifiables par le préfixe d'URL https://simulation.test/), faisant artificiellement grimper le taux de fake global affiché à ~80 %. Ces documents ont été supprimés des deux bases ; le taux de fake résiduel réel est revenu à ~52 %. Le service drift-injector est désormais désactivé par défaut (docker-compose.yml) : le drift ne se déclenche plus qu'à la demande, depuis le dashboard ou l'API.</w:t>
+      </w:r>
+    </w:p>
+    <w:p>
+      <w:r>
+        <w:rPr>
+          <w:b/>
+        </w:rPr>
+        <w:t>🔴 Seuil de décision relevé de 0.65 à 0.75</w:t>
+      </w:r>
+    </w:p>
+    <w:p>
+      <w:r>
+        <w:t>En complément de la correction du bug de format, le seuil de classification p_fake a été relevé de 0.65 à 0.75 dans nlp_classifier.py et web_search.py, réduisant davantage les faux positifs sur les dépêches d'agences officielles.</w:t>
+      </w:r>
+    </w:p>
+    <w:p>
+      <w:r>
+        <w:rPr>
+          <w:b/>
+        </w:rPr>
+        <w:t>🔴 Le drift n'est plus un état permanent — fenêtre de visualisation puis retour automatique</w:t>
+      </w:r>
+    </w:p>
+    <w:p>
+      <w:r>
+        <w:t>Auparavant, la phase de « récupération » suivait l'injection de drift avec seulement 5 secondes de délai, rendant le drift quasiment invisible dans Grafana/Streamlit avant sa propre correction. scripts/inject_drift_simulation.py introduit maintenant un paramètre visualization_window (60-600 s, 300 s = 5 min par défaut) : le drift reste actif et observable pendant cette fenêtre, puis des articles réels sont envoyés automatiquement pour ramener le modèle et les statistiques à la normale — sans intervention manuelle. Le endpoint POST /api/v1/drift/inject expose ce paramètre ; l'interface Streamlit propose un curseur (1-10 min) pour le régler. Testé de bout en bout : cycle complet drift → fenêtre → récupération automatique validé.</w:t>
+      </w:r>
+    </w:p>
+    <w:p>
+      <w:r>
+        <w:rPr>
+          <w:b/>
+        </w:rPr>
+        <w:t>🔴 Enrichissement du corpus d'entraînement — contexte africain multilingue</w:t>
+      </w:r>
+    </w:p>
+    <w:p>
+      <w:r>
+        <w:t>Le script scripts/download_african_datasets.py a été exécuté pour enrichir data/raw/africa_news/africa_news.csv : ajout de 2 742 articles réels MasakhaNEWS couvrant 11 langues africaines (amharique, haoussa, igbo, lingala, oromo, pidgin nigérian, shona, somali, swahili, tigrinya, yoruba) ainsi que des articles récents via Google News RSS (sources africaines). Le corpus africain total passe de 854 à 3 601 exemples. Limite constatée : Africa Check (source de fact-checks africains) est inaccessible depuis l'environnement de développement (blocage Cloudflare 403) ; le volume de fake news africaines authentiques reste donc limité (~77 exemples), documenté comme limite connue pour les travaux futurs. scripts/train_model.py applique un facteur de sur-pondération (--africa_boost, ×5 par défaut) sur les exemples africains via WeightedRandomSampler, sans supprimer aucune donnée existante (welfake, isot, liar, fakenewsnet conservés intégralement).</w:t>
+      </w:r>
+    </w:p>
+    <w:p>
+      <w:r>
+        <w:rPr>
+          <w:b/>
+        </w:rPr>
+        <w:t>🔴 Ré-entraînement complet du modèle Continual-DistilBERT</w:t>
+      </w:r>
+    </w:p>
+    <w:p>
+      <w:r>
+        <w:t>Un nouveau cycle d'entraînement complet a été lancé sur le corpus enrichi (55 356 exemples d'entraînement, 50/50 fake/réel). Le script train_model.py a été rendu résilient aux coupures (sauvegarde d'un checkpoint de reprise tous les 100 batchs, argument --save_every) suite à des interruptions dues à des déconnexions intempestives du disque externe pendant l'entraînement (voir point suivant).</w:t>
+      </w:r>
+    </w:p>
+    <w:p>
+      <w:r>
+        <w:rPr>
+          <w:b/>
+        </w:rPr>
+        <w:t>🔴 Stabilisation Docker — instabilité récurrente du disque externe, corrigée de façon permanente</w:t>
+      </w:r>
+    </w:p>
+    <w:p>
+      <w:r>
+        <w:t>Le disque externe hébergeant le projet s'est déconnecté/reconnecté à de multiples reprises pendant cette session (points de montage successifs local5→local6→local7→local8→disqueD), cassant à chaque fois les points de montage (bind mounts) Docker. Diagnostic confirmé via journalctl/dmesg : véritables erreurs matérielles SATA ("ata1.00: error: { UNC }"), pas un simple problème de configuration logicielle. Cause racine du changement de nom de dossier : la partition n'était déclarée nulle part dans /etc/fstab, donc udisks2/GNOME la remontait automatiquement sous un nouveau nom à chaque reconnexion. Correction définitive apportée : ajout d'une entrée fixe dans /etc/fstab basée sur l'UUID de la partition (et non plus sur un nom généré dynamiquement), avec l'option 'nofail' pour ne jamais bloquer le démarrage. Le pilote noyau ntfs3 s'étant révélé incompatible avec le volume après une déconnexion brutale (erreur 'bad superblock'), le montage a été basculé sur le pilote ntfs-3g (FUSE), qui s'est montré fiable. Le point de montage est désormais fixe et permanent : /mnt/disqueD/ISTIN/MASTER/M2/S1/PROJET TUTORE/desinformation-pipeline. Les volumes nommés Docker (mongodb_data, elasticsearch_data) n'ont à aucun moment été affectés — aucune perte de données sur toute la session malgré les multiples coupures.</w:t>
       </w:r>
     </w:p>
     <w:sectPr>

</xml_diff>